<commit_message>
docs: remove (1장 요약 보고서) text, top badge, and approval box from all summary and printable documents
</commit_message>
<xml_diff>
--- a/2026_미끼백신_향후실험일정_1장요약보고서.docx
+++ b/2026_미끼백신_향후실험일정_1장요약보고서.docx
@@ -2,284 +2,35 @@
 <file path=word/document.xml><?xml version="1.0" encoding="utf-8"?>
 <w:document xmlns:wpc="http://schemas.microsoft.com/office/word/2010/wordprocessingCanvas" xmlns:mo="http://schemas.microsoft.com/office/mac/office/2008/main" xmlns:mc="http://schemas.openxmlformats.org/markup-compatibility/2006" xmlns:mv="urn:schemas-microsoft-com:mac:vml" xmlns:o="urn:schemas-microsoft-com:office:office" xmlns:r="http://schemas.openxmlformats.org/officeDocument/2006/relationships" xmlns:m="http://schemas.openxmlformats.org/officeDocument/2006/math" xmlns:v="urn:schemas-microsoft-com:vml" xmlns:wp14="http://schemas.microsoft.com/office/word/2010/wordprocessingDrawing" xmlns:wp="http://schemas.openxmlformats.org/drawingml/2006/wordprocessingDrawing" xmlns:w10="urn:schemas-microsoft-com:office:word" xmlns:w="http://schemas.openxmlformats.org/wordprocessingml/2006/main" xmlns:w14="http://schemas.microsoft.com/office/word/2010/wordml" xmlns:wpg="http://schemas.microsoft.com/office/word/2010/wordprocessingGroup" xmlns:wpi="http://schemas.microsoft.com/office/word/2010/wordprocessingInk" xmlns:wne="http://schemas.microsoft.com/office/word/2006/wordml" xmlns:wps="http://schemas.microsoft.com/office/word/2010/wordprocessingShape" mc:Ignorable="w14 wp14">
   <w:body>
-    <w:tbl>
-      <w:tblPr>
-        <w:tblW w:type="auto" w:w="0"/>
-        <w:jc w:val="center"/>
-        <w:tblLayout w:type="fixed"/>
-        <w:tblLook w:firstColumn="1" w:firstRow="1" w:lastColumn="0" w:lastRow="0" w:noHBand="0" w:noVBand="1" w:val="04A0"/>
-      </w:tblPr>
-      <w:tblGrid>
-        <w:gridCol w:w="5159"/>
-        <w:gridCol w:w="5159"/>
-      </w:tblGrid>
-      <w:tr>
-        <w:tc>
-          <w:tcPr>
-            <w:tcW w:type="dxa" w:w="7370"/>
-            <w:tcMar>
-              <w:top w:w="0" w:type="dxa"/>
-              <w:bottom w:w="40" w:type="dxa"/>
-              <w:left w:w="0" w:type="dxa"/>
-              <w:right w:w="80" w:type="dxa"/>
-            </w:tcMar>
-          </w:tcPr>
-          <w:p>
-            <w:pPr>
-              <w:spacing w:before="0" w:after="40"/>
-            </w:pPr>
-            <w:r>
-              <w:rPr>
-                <w:b/>
-                <w:color w:val="0284C7"/>
-                <w:sz w:val="16"/>
-              </w:rPr>
-              <w:t>국립야생동물질병관리원 실증 용역 과제 | 1장 요약 브리핑 보고서</w:t>
-            </w:r>
-          </w:p>
-          <w:p>
-            <w:pPr>
-              <w:spacing w:before="0" w:after="80"/>
-            </w:pPr>
-            <w:r>
-              <w:rPr>
-                <w:b/>
-                <w:color w:val="0F172A"/>
-                <w:sz w:val="26"/>
-              </w:rPr>
-              <w:t>2026년 야생 멧돼지 미끼백신 향후 실험 일정 및 실증 계획</w:t>
-            </w:r>
-          </w:p>
-          <w:p>
-            <w:pPr>
-              <w:spacing w:before="0" w:after="40" w:line="276" w:lineRule="auto"/>
-            </w:pPr>
-            <w:r>
-              <w:rPr>
-                <w:color w:val="475569"/>
-                <w:sz w:val="15"/>
-              </w:rPr>
-              <w:t>• 과제명: 2026년 야생 멧돼지 미끼백신 섭취 기호도 평가 및 차세대 제형 현장 실증</w:t>
-              <w:br/>
-              <w:t>• 보고일자: 2026년 10월 16일  |  보고자: 권용태 사무국장 (야생생물관리협회)</w:t>
-              <w:br/>
-              <w:t>• 실증거점: 공주 C지점(문금리 142-5, 최근 멧돼지 4마리 집중 출현지) 및 공주 A·B, 경산 D</w:t>
-            </w:r>
-          </w:p>
-        </w:tc>
-        <w:tc>
-          <w:tcPr>
-            <w:tcW w:type="dxa" w:w="2948"/>
-            <w:tcMar>
-              <w:top w:w="0" w:type="dxa"/>
-              <w:bottom w:w="40" w:type="dxa"/>
-              <w:left w:w="40" w:type="dxa"/>
-              <w:right w:w="0" w:type="dxa"/>
-            </w:tcMar>
-          </w:tcPr>
-          <w:p/>
-          <w:tbl>
-            <w:tblPr>
-              <w:tblW w:type="auto" w:w="0"/>
-              <w:jc w:val="right"/>
-              <w:tblLook w:firstColumn="1" w:firstRow="1" w:lastColumn="0" w:lastRow="0" w:noHBand="0" w:noVBand="1" w:val="04A0"/>
-              <w:tblBorders>
-                <w:top w:val="single" w:sz="4" w:space="0" w:color="94A3B8"/>
-                <w:bottom w:val="single" w:sz="4" w:space="0" w:color="94A3B8"/>
-                <w:insideH w:val="single" w:sz="4" w:space="0" w:color="94A3B8"/>
-                <w:insideV w:val="single" w:sz="4" w:space="0" w:color="94A3B8"/>
-                <w:left w:val="none"/>
-                <w:right w:val="none"/>
-              </w:tblBorders>
-            </w:tblPr>
-            <w:tblGrid>
-              <w:gridCol w:w="737"/>
-              <w:gridCol w:w="737"/>
-              <w:gridCol w:w="737"/>
-              <w:gridCol w:w="737"/>
-            </w:tblGrid>
-            <w:tr>
-              <w:tc>
-                <w:tcPr>
-                  <w:tcW w:type="dxa" w:w="454"/>
-                  <w:shd w:fill="F1F5F9"/>
-                  <w:tcMar>
-                    <w:top w:w="40" w:type="dxa"/>
-                    <w:bottom w:w="40" w:type="dxa"/>
-                    <w:left w:w="20" w:type="dxa"/>
-                    <w:right w:w="20" w:type="dxa"/>
-                  </w:tcMar>
-                </w:tcPr>
-                <w:p>
-                  <w:pPr>
-                    <w:jc w:val="center"/>
-                  </w:pPr>
-                  <w:r>
-                    <w:rPr>
-                      <w:b/>
-                      <w:color w:val="334155"/>
-                      <w:sz w:val="15"/>
-                    </w:rPr>
-                    <w:t>결</w:t>
-                    <w:br/>
-                    <w:t>재</w:t>
-                  </w:r>
-                </w:p>
-              </w:tc>
-              <w:tc>
-                <w:tcPr>
-                  <w:tcW w:type="dxa" w:w="794"/>
-                  <w:shd w:fill="F1F5F9"/>
-                  <w:tcMar>
-                    <w:top w:w="40" w:type="dxa"/>
-                    <w:bottom w:w="40" w:type="dxa"/>
-                    <w:left w:w="20" w:type="dxa"/>
-                    <w:right w:w="20" w:type="dxa"/>
-                  </w:tcMar>
-                </w:tcPr>
-                <w:p>
-                  <w:pPr>
-                    <w:jc w:val="center"/>
-                  </w:pPr>
-                  <w:r>
-                    <w:rPr>
-                      <w:b/>
-                      <w:color w:val="334155"/>
-                      <w:sz w:val="15"/>
-                    </w:rPr>
-                    <w:t>담 당</w:t>
-                  </w:r>
-                </w:p>
-              </w:tc>
-              <w:tc>
-                <w:tcPr>
-                  <w:tcW w:type="dxa" w:w="794"/>
-                  <w:shd w:fill="F1F5F9"/>
-                  <w:tcMar>
-                    <w:top w:w="40" w:type="dxa"/>
-                    <w:bottom w:w="40" w:type="dxa"/>
-                    <w:left w:w="20" w:type="dxa"/>
-                    <w:right w:w="20" w:type="dxa"/>
-                  </w:tcMar>
-                </w:tcPr>
-                <w:p>
-                  <w:pPr>
-                    <w:jc w:val="center"/>
-                  </w:pPr>
-                  <w:r>
-                    <w:rPr>
-                      <w:b/>
-                      <w:color w:val="334155"/>
-                      <w:sz w:val="15"/>
-                    </w:rPr>
-                    <w:t>검 토</w:t>
-                  </w:r>
-                </w:p>
-              </w:tc>
-              <w:tc>
-                <w:tcPr>
-                  <w:tcW w:type="dxa" w:w="794"/>
-                  <w:shd w:fill="F1F5F9"/>
-                  <w:tcMar>
-                    <w:top w:w="40" w:type="dxa"/>
-                    <w:bottom w:w="40" w:type="dxa"/>
-                    <w:left w:w="20" w:type="dxa"/>
-                    <w:right w:w="20" w:type="dxa"/>
-                  </w:tcMar>
-                </w:tcPr>
-                <w:p>
-                  <w:pPr>
-                    <w:jc w:val="center"/>
-                  </w:pPr>
-                  <w:r>
-                    <w:rPr>
-                      <w:b/>
-                      <w:color w:val="334155"/>
-                      <w:sz w:val="15"/>
-                    </w:rPr>
-                    <w:t>결 재</w:t>
-                  </w:r>
-                </w:p>
-              </w:tc>
-            </w:tr>
-            <w:tr>
-              <w:tc>
-                <w:tcPr>
-                  <w:tcW w:type="dxa" w:w="454"/>
-                  <w:tcMar>
-                    <w:top w:w="120" w:type="dxa"/>
-                    <w:bottom w:w="120" w:type="dxa"/>
-                    <w:left w:w="20" w:type="dxa"/>
-                    <w:right w:w="20" w:type="dxa"/>
-                  </w:tcMar>
-                </w:tcPr>
-                <w:p>
-                  <w:pPr>
-                    <w:jc w:val="center"/>
-                  </w:pPr>
-                </w:p>
-              </w:tc>
-              <w:tc>
-                <w:tcPr>
-                  <w:tcW w:type="dxa" w:w="794"/>
-                  <w:tcMar>
-                    <w:top w:w="120" w:type="dxa"/>
-                    <w:bottom w:w="120" w:type="dxa"/>
-                    <w:left w:w="20" w:type="dxa"/>
-                    <w:right w:w="20" w:type="dxa"/>
-                  </w:tcMar>
-                </w:tcPr>
-                <w:p>
-                  <w:pPr>
-                    <w:jc w:val="center"/>
-                  </w:pPr>
-                  <w:r>
-                    <w:rPr>
-                      <w:b/>
-                      <w:sz w:val="16"/>
-                    </w:rPr>
-                    <w:t>권용태</w:t>
-                  </w:r>
-                </w:p>
-              </w:tc>
-              <w:tc>
-                <w:tcPr>
-                  <w:tcW w:type="dxa" w:w="794"/>
-                  <w:tcMar>
-                    <w:top w:w="120" w:type="dxa"/>
-                    <w:bottom w:w="120" w:type="dxa"/>
-                    <w:left w:w="20" w:type="dxa"/>
-                    <w:right w:w="20" w:type="dxa"/>
-                  </w:tcMar>
-                </w:tcPr>
-                <w:p>
-                  <w:pPr>
-                    <w:jc w:val="center"/>
-                  </w:pPr>
-                </w:p>
-              </w:tc>
-              <w:tc>
-                <w:tcPr>
-                  <w:tcW w:type="dxa" w:w="794"/>
-                  <w:tcMar>
-                    <w:top w:w="120" w:type="dxa"/>
-                    <w:bottom w:w="120" w:type="dxa"/>
-                    <w:left w:w="20" w:type="dxa"/>
-                    <w:right w:w="20" w:type="dxa"/>
-                  </w:tcMar>
-                </w:tcPr>
-                <w:p>
-                  <w:pPr>
-                    <w:jc w:val="center"/>
-                  </w:pPr>
-                </w:p>
-              </w:tc>
-            </w:tr>
-          </w:tbl>
-          <w:p/>
-        </w:tc>
-      </w:tr>
-    </w:tbl>
+    <w:p>
+      <w:pPr>
+        <w:spacing w:before="0" w:after="80"/>
+      </w:pPr>
+      <w:r>
+        <w:rPr>
+          <w:b/>
+          <w:color w:val="0F172A"/>
+          <w:sz w:val="28"/>
+        </w:rPr>
+        <w:t>2026년 야생 멧돼지 미끼백신 향후 실험 일정 및 실증 계획</w:t>
+      </w:r>
+    </w:p>
+    <w:p>
+      <w:pPr>
+        <w:spacing w:before="0" w:after="120" w:line="276" w:lineRule="auto"/>
+      </w:pPr>
+      <w:r>
+        <w:rPr>
+          <w:color w:val="475569"/>
+          <w:sz w:val="15"/>
+        </w:rPr>
+        <w:t>• 과제명: 2026년 야생 멧돼지 미끼백신 섭취 기호도 평가 및 차세대 제형 현장 실증</w:t>
+        <w:br/>
+        <w:t>• 보고일자: 2026년 10월 16일  |  보고자: 권용태 사무국장 (야생생물관리협회)</w:t>
+        <w:br/>
+        <w:t>• 실증거점: 공주 C지점(문금리 142-5, 최근 멧돼지 4마리 집중 출현지) 및 공주 A·B, 경산 D</w:t>
+      </w:r>
+    </w:p>
     <w:tbl>
       <w:tblPr>
         <w:tblW w:type="auto" w:w="0"/>

</xml_diff>

<commit_message>
chore: sync C-site actual boar video counts (35/80) and update 1-page summary report with Oct 17 bait test installation
</commit_message>
<xml_diff>
--- a/2026_미끼백신_향후실험일정_1장요약보고서.docx
+++ b/2026_미끼백신_향후실험일정_1장요약보고서.docx
@@ -12,7 +12,7 @@
           <w:color w:val="0F172A"/>
           <w:sz w:val="28"/>
         </w:rPr>
-        <w:t>2026년 야생 멧돼지 미끼백신 향후 실험 일정 및 실증 계획</w:t>
+        <w:t>2026년 야생 멧돼지 미끼백신 향후 실험 일정 및 실증 현황</w:t>
       </w:r>
     </w:p>
     <w:p>
@@ -26,9 +26,9 @@
         </w:rPr>
         <w:t>• 과제명: 2026년 야생 멧돼지 미끼백신 섭취 기호도 평가 및 차세대 제형 현장 실증</w:t>
         <w:br/>
-        <w:t>• 보고일자: 2026년 10월 16일  |  보고자: 권용태 사무국장 (야생생물관리협회)</w:t>
+        <w:t>• 보고일자: 2026년 10월 18일 (10/17 현장 설치 반영)  |  보고자: 권용태 사무국장 (야생생물관리협회)</w:t>
         <w:br/>
-        <w:t>• 실증거점: 공주 C지점(문금리 142-5, 최근 멧돼지 4마리 집중 출현지) 및 공주 A·B, 경산 D</w:t>
+        <w:t>• 실증거점: 공주 C지점(문금리 142-5, 멧돼지 35건 확정·집중 출현지) 및 공주 A·B, 경산 D</w:t>
       </w:r>
     </w:p>
     <w:tbl>
@@ -150,7 +150,7 @@
                 <w:color w:val="DC2626"/>
                 <w:sz w:val="17"/>
               </w:rPr>
-              <w:t>71건 (10/15 야간 4마리 집중 출현)</w:t>
+              <w:t>80건 (C지점 35건·10/15 4마리 집중)</w:t>
             </w:r>
           </w:p>
         </w:tc>
@@ -184,7 +184,7 @@
                 <w:color w:val="0F172A"/>
                 <w:sz w:val="17"/>
               </w:rPr>
-              <w:t>5종 (미끼 4종 + 미끼틀 1종)</w:t>
+              <w:t>5종 (미끼 4종 + 대조군 1종 설치완료)</w:t>
             </w:r>
           </w:p>
         </w:tc>
@@ -337,7 +337,7 @@
                 <w:color w:val="0F172A"/>
                 <w:sz w:val="16"/>
               </w:rPr>
-              <w:t>단순 통과 및 자연 채식 (누적 35건)</w:t>
+              <w:t>단순 통과 및 자연 채식 (누적 37건)</w:t>
               <w:br/>
             </w:r>
             <w:r>
@@ -345,7 +345,7 @@
                 <w:color w:val="475569"/>
                 <w:sz w:val="14"/>
               </w:rPr>
-              <w:t>고라니 23건, 오소리 12건 출현 시 미끼틀 주변 단순 통과 및 자연 초생 채식만 관찰됨 (미끼 섭취 시도 미확인)</w:t>
+              <w:t>고라니 25건(공주C 22·공주B 3), 오소리 12건 출현 시 미끼틀 주변 단순 통과 및 자연 초생 채식만 관찰됨 (미끼 섭취 시도 미확인)</w:t>
             </w:r>
           </w:p>
         </w:tc>
@@ -361,7 +361,7 @@
           <w:color w:val="0F172A"/>
           <w:sz w:val="19"/>
         </w:rPr>
-        <w:t>2. 향후 핵심 실험 일정 로드맵 (2026.10.11 ~ 11월 중순)</w:t>
+        <w:t>2. 핵심 실험 일정 로드맵 및 진행 현황 (2026.10.11 ~ 11월 중순)</w:t>
       </w:r>
     </w:p>
     <w:tbl>
@@ -585,7 +585,7 @@
               </w:rPr>
               <w:t>• 작업자: 권용태(사무국장)</w:t>
               <w:br/>
-              <w:t>• 10/11 살포 후 10/15 야간 멧돼지 4마리 집중 출현(10건 연속) 확인 ➔ 비교 테스트 최적 조건 충족</w:t>
+              <w:t>• 10/11 살포 후 10/15 야간 멧돼지 4마리 집중 출현(10건 연속, 누적 35건) 확인 ➔ 비교 테스트 최적 조건 충족</w:t>
             </w:r>
           </w:p>
         </w:tc>
@@ -718,7 +718,7 @@
               </w:rPr>
               <w:t>Step 3</w:t>
               <w:br/>
-              <w:t>(실행예정)</w:t>
+              <w:t>(설치완료·진행중)</w:t>
             </w:r>
           </w:p>
         </w:tc>
@@ -743,7 +743,7 @@
               </w:rPr>
               <w:t>10.17 ~ 10.31</w:t>
               <w:br/>
-              <w:t>(2주간 집중)</w:t>
+              <w:t>(10/17 설치완료)</w:t>
             </w:r>
           </w:p>
         </w:tc>
@@ -765,11 +765,11 @@
               <w:rPr>
                 <w:sz w:val="14"/>
               </w:rPr>
-              <w:t>공주 C지점(문금리 142-5) 미끼 4종 + 미끼틀 1종(총 5종) 2주간 비교 실증</w:t>
+              <w:t>공주 C지점(문금리 142-5) 미끼 4종 + 대조군(총 5종) 실증 설치 완료 및 2주간 집중 비교</w:t>
               <w:br/>
-              <w:t>• 10/15 야간 멧돼지 4마리 집중 출현으로 테스트 최적 조건이 충족된 C지점에 5종 동시 비교 설치</w:t>
+              <w:t>• 10/17(토) 08:00~08:35 C지점 지표 정비 후 차세대 미끼 4종 및 대조군 지표면 그리드(Array) 배치 완료</w:t>
               <w:br/>
-              <w:t>• 무인 센서 카메라 24시간 초단위 감시 + 2~3일 주기 잔여 중량/형태/경도 정밀 실측</w:t>
+              <w:t>• 무인 센서 카메라 화각 밀착 재조정 완료(24시간 감시) + 2~3일 주기 잔여 중량/형태/경도 정밀 실측</w:t>
             </w:r>
           </w:p>
         </w:tc>
@@ -791,9 +791,9 @@
               <w:rPr>
                 <w:sz w:val="14"/>
               </w:rPr>
-              <w:t>• 총 5종 동시 비교 실증</w:t>
+              <w:t>• 작업자: 권용태(사무국장)</w:t>
               <w:br/>
-              <w:t>• 섭취 반응, 형태 내구성, 환경 변화 실측 데이터 확보</w:t>
+              <w:t>• 10/17 C지점 5종 설치 및 B지점 점검 완료 (현장사진 6장 기록)</w:t>
             </w:r>
           </w:p>
         </w:tc>
@@ -913,7 +913,7 @@
           <w:color w:val="0F172A"/>
           <w:sz w:val="19"/>
         </w:rPr>
-        <w:t>3. 차세대 미끼 4종 실물 스펙 및 공주 C지점(10/17) 5종 비교 실증 계획</w:t>
+        <w:t>3. 차세대 미끼 4종 실물 스펙 및 공주 C지점(10/17 설치 완료) 5종 비교 실증 현황</w:t>
       </w:r>
     </w:p>
     <w:tbl>
@@ -1151,14 +1151,14 @@
           <w:color w:val="0284C7"/>
           <w:sz w:val="15"/>
         </w:rPr>
-        <w:t xml:space="preserve">★ 10/17 공주 C지점(문금리 142-5) 5종 비교 실증 (테스트 최적 조건 충족): </w:t>
+        <w:t xml:space="preserve">★ 10/17 공주 C지점(문금리 142-5) 5종 비교 실증 설치 완료 (2주 집중 실증 진행 중): </w:t>
       </w:r>
       <w:r>
         <w:rPr>
           <w:color w:val="334155"/>
           <w:sz w:val="14"/>
         </w:rPr>
-        <w:t>10/15 야간 멧돼지 4마리가 집중 출현(10건 연속, 7분 이상 집중 체류)하여 비교 테스트를 실시하기 위한 최상의 현장 조건이 충족된 C지점에 테스트 미끼 4종(A·B·C·D)과 기존 동물사료 미끼틀 1종(대조군)을 동시 설치하여 2주간(10.17~10.31) 직접 비교 검증을 수행합니다.</w:t>
+        <w:t>10/15 야간 멧돼지 4마리 집중 출현(10건 연속, 누적 35건 확정)으로 최적 테스트 조건이 충족된 C지점에 10/17 차세대 미끼 4종(A·B·C·D)과 기존 동물사료 미끼틀/알곡 대조군을 그리드 배열로 동시 설치 완료하여 2주간(10.17~10.31) 직접 비교 검증을 수행 중입니다.</w:t>
       </w:r>
     </w:p>
     <w:p>

</xml_diff>

<commit_message>
feat: add 4 videos, 6 inspection photos, activity log, and field consumption results (B 100%, C 30%) on 2026-10-20
</commit_message>
<xml_diff>
--- a/2026_미끼백신_향후실험일정_1장요약보고서.docx
+++ b/2026_미끼백신_향후실험일정_1장요약보고서.docx
@@ -718,7 +718,7 @@
               </w:rPr>
               <w:t>Step 3</w:t>
               <w:br/>
-              <w:t>(설치완료·진행중)</w:t>
+              <w:t>(설치·실측완료)</w:t>
             </w:r>
           </w:p>
         </w:tc>
@@ -743,7 +743,7 @@
               </w:rPr>
               <w:t>10.17 ~ 10.31</w:t>
               <w:br/>
-              <w:t>(10/17 설치완료)</w:t>
+              <w:t>(10/20 3일차실측)</w:t>
             </w:r>
           </w:p>
         </w:tc>
@@ -765,11 +765,11 @@
               <w:rPr>
                 <w:sz w:val="14"/>
               </w:rPr>
-              <w:t>공주 C지점(문금리 142-5) 미끼 4종 + 대조군(총 5종) 실증 설치 완료 및 2주간 집중 비교</w:t>
+              <w:t>공주 C지점(문금리 142-5) 미끼 4종 + 대조군(총 5종) 설치 및 3일차 섭취율 실측</w:t>
               <w:br/>
-              <w:t>• 10/17(토) 08:00~08:35 C지점 지표 정비 후 차세대 미끼 4종 및 대조군 지표면 그리드(Array) 배치 완료</w:t>
+              <w:t>• 10/17 설치 ➔ 10/20 현장 실측: 미끼B 10개 완식(100%), 미끼C 3개(30%), 미끼A·D·대조군 각 1개(10%)</w:t>
               <w:br/>
-              <w:t>• 무인 센서 카메라 화각 밀착 재조정 완료(24시간 상시 감시 및 모니터링 진행 중)</w:t>
+              <w:t>• 10/20 새벽 멧돼지 섭취 영상 3건 확보 / 24시간 상시 모니터링</w:t>
             </w:r>
           </w:p>
         </w:tc>
@@ -793,7 +793,7 @@
               </w:rPr>
               <w:t>• 작업자: 권용태(사무국장)</w:t>
               <w:br/>
-              <w:t>• 10/17 C지점 5종 설치 및 B지점 점검 완료 (현장사진 6장 기록)</w:t>
+              <w:t>• 10/17 설치 및 10/20 3일차 실측 완료 (현장사진 12장, 10/20 영상 4건 기록)</w:t>
             </w:r>
           </w:p>
         </w:tc>

</xml_diff>

<commit_message>
feat: add 4 confirmed wild boar videos (2026-10-22) sniffing test bait and roaming site C on dashboard
</commit_message>
<xml_diff>
--- a/2026_미끼백신_향후실험일정_1장요약보고서.docx
+++ b/2026_미끼백신_향후실험일정_1장요약보고서.docx
@@ -769,7 +769,7 @@
               <w:br/>
               <w:t>• 10/17 설치 ➔ 10/20 현장 실측: 미끼B 10개 완식(100%), 미끼C 3개(30%), 미끼A·D·대조군 각 1개(10%)</w:t>
               <w:br/>
-              <w:t>• 10/20 심야 멧돼지 1마리 테스트용 먹이 섭취 영상 4건 확보 / 24시간 상시 감시</w:t>
+              <w:t>• 10/20 멧돼지 섭취 4건 및 10/22 미끼 접촉·배회 4건 확보 / 24시간 상시 감시</w:t>
             </w:r>
           </w:p>
         </w:tc>
@@ -793,7 +793,7 @@
               </w:rPr>
               <w:t>• 작업자: 권용태(사무국장)</w:t>
               <w:br/>
-              <w:t>• 10/17 설치 및 10/20 3일차 실측 완료 (현장사진 12장, 10/20 영상 4건 기록)</w:t>
+              <w:t>• 10/17 설치 ➔ 10/20 실측 ➔ 10/22 미끼 접촉 실증 (현장사진 12장, 멧돼지 영상 8건)</w:t>
             </w:r>
           </w:p>
         </w:tc>

</xml_diff>

<commit_message>
feat: add 9 non-target badger videos (2026-10-23) consuming test feed while avoiding 4 vaccine baits on dashboard
</commit_message>
<xml_diff>
--- a/2026_미끼백신_향후실험일정_1장요약보고서.docx
+++ b/2026_미끼백신_향후실험일정_1장요약보고서.docx
@@ -769,7 +769,7 @@
               <w:br/>
               <w:t>• 10/17 설치 ➔ 10/20 현장 실측: 미끼B 10개 완식(100%), 미끼C 3개(30%), 미끼A·D·대조군 각 1개(10%)</w:t>
               <w:br/>
-              <w:t>• 10/20 멧돼지 섭취 4건 및 10/22 미끼 접촉·배회 4건 확보 / 24시간 상시 감시</w:t>
+              <w:t>• 10/20 멧돼지 섭취 4건, 10/22 미끼 접촉 4건, 10/23 오소리 2마리 고형사료 섭취 9건 확보 / 24시간 상시 감시</w:t>
             </w:r>
           </w:p>
         </w:tc>
@@ -793,7 +793,7 @@
               </w:rPr>
               <w:t>• 작업자: 권용태(사무국장)</w:t>
               <w:br/>
-              <w:t>• 10/17 설치 ➔ 10/20 실측 ➔ 10/22 미끼 접촉 실증 (현장사진 12장, 멧돼지 영상 8건)</w:t>
+              <w:t>• 10/17 설치 ➔ 10/20 실측 ➔ 10/22 미끼 접촉 ➔ 10/23 비대상 안전성 실증 (사진 12장, 영상 18건)</w:t>
             </w:r>
           </w:p>
         </w:tc>

</xml_diff>

<commit_message>
feat: add 1 non-target badger video (2026-10-24) passing by bait site on dashboard
</commit_message>
<xml_diff>
--- a/2026_미끼백신_향후실험일정_1장요약보고서.docx
+++ b/2026_미끼백신_향후실험일정_1장요약보고서.docx
@@ -769,7 +769,7 @@
               <w:br/>
               <w:t>• 10/17 설치 ➔ 10/20 현장 실측: 미끼B 10개 완식(100%), 미끼C 3개(30%), 미끼A·D·대조군 각 1개(10%)</w:t>
               <w:br/>
-              <w:t>• 10/20 멧돼지 섭취 4건, 10/22 미끼 접촉 4건, 10/23 오소리 2마리 고형사료 섭취 9건 확보 / 24시간 상시 감시</w:t>
+              <w:t>• 10/20 멧돼지 섭취 4건, 10/22 미끼 접촉 4건, 10/23~24 오소리 비대상 관찰 10건 확보 / 24시간 상시 감시</w:t>
             </w:r>
           </w:p>
         </w:tc>
@@ -793,7 +793,7 @@
               </w:rPr>
               <w:t>• 작업자: 권용태(사무국장)</w:t>
               <w:br/>
-              <w:t>• 10/17 설치 ➔ 10/20 실측 ➔ 10/22 미끼 접촉 ➔ 10/23 비대상 안전성 실증 (사진 12장, 영상 18건)</w:t>
+              <w:t>• 10/17 설치 ➔ 10/20 실측 ➔ 10/22 접촉 ➔ 10/23~24 비대상 안전성 실증 (사진 12장, 영상 19건)</w:t>
             </w:r>
           </w:p>
         </w:tc>

</xml_diff>

<commit_message>
feat: add 2 non-target badger videos (2026-10-24 23:10~23:11) roaming and sniffing bait site on dashboard
</commit_message>
<xml_diff>
--- a/2026_미끼백신_향후실험일정_1장요약보고서.docx
+++ b/2026_미끼백신_향후실험일정_1장요약보고서.docx
@@ -769,7 +769,7 @@
               <w:br/>
               <w:t>• 10/17 설치 ➔ 10/20 현장 실측: 미끼B 10개 완식(100%), 미끼C 3개(30%), 미끼A·D·대조군 각 1개(10%)</w:t>
               <w:br/>
-              <w:t>• 10/20 멧돼지 섭취 4건, 10/22 미끼 접촉 4건, 10/23~24 오소리 비대상 관찰 10건 확보 / 24시간 상시 감시</w:t>
+              <w:t>• 10/20 멧돼지 섭취 4건, 10/22 미끼 접촉 4건, 10/23~24 오소리 비대상 관찰 12건 확보 / 24시간 상시 감시</w:t>
             </w:r>
           </w:p>
         </w:tc>
@@ -793,7 +793,7 @@
               </w:rPr>
               <w:t>• 작업자: 권용태(사무국장)</w:t>
               <w:br/>
-              <w:t>• 10/17 설치 ➔ 10/20 실측 ➔ 10/22 접촉 ➔ 10/23~24 비대상 안전성 실증 (사진 12장, 영상 19건)</w:t>
+              <w:t>• 10/17 설치 ➔ 10/20 실측 ➔ 10/22 접촉 ➔ 10/23~24 비대상 안전성 실증 (사진 12장, 영상 21건)</w:t>
             </w:r>
           </w:p>
         </w:tc>

</xml_diff>

<commit_message>
feat: add 3 non-target badger videos (2026-10-25) passing by and roaming bait site on dashboard
</commit_message>
<xml_diff>
--- a/2026_미끼백신_향후실험일정_1장요약보고서.docx
+++ b/2026_미끼백신_향후실험일정_1장요약보고서.docx
@@ -769,7 +769,7 @@
               <w:br/>
               <w:t>• 10/17 설치 ➔ 10/20 현장 실측: 미끼B 10개 완식(100%), 미끼C 3개(30%), 미끼A·D·대조군 각 1개(10%)</w:t>
               <w:br/>
-              <w:t>• 10/20 멧돼지 섭취 4건, 10/22 미끼 접촉 4건, 10/23~24 오소리 비대상 관찰 12건 확보 / 24시간 상시 감시</w:t>
+              <w:t>• 10/20 멧돼지 섭취 4건, 10/22 미끼 접촉 4건, 10/23~25 오소리 비대상 관찰 15건 확보 / 24시간 상시 감시</w:t>
             </w:r>
           </w:p>
         </w:tc>
@@ -793,7 +793,7 @@
               </w:rPr>
               <w:t>• 작업자: 권용태(사무국장)</w:t>
               <w:br/>
-              <w:t>• 10/17 설치 ➔ 10/20 실측 ➔ 10/22 접촉 ➔ 10/23~24 비대상 안전성 실증 (사진 12장, 영상 21건)</w:t>
+              <w:t>• 10/17 설치 ➔ 10/20 실측 ➔ 10/22 접촉 ➔ 10/23~25 비대상 안전성 실증 (사진 12장, 영상 24건)</w:t>
             </w:r>
           </w:p>
         </w:tc>

</xml_diff>

<commit_message>
feat: add 8 videos (5 confirmed wild boar, 3 non-target badger) for 2026-10-26 on dashboard
</commit_message>
<xml_diff>
--- a/2026_미끼백신_향후실험일정_1장요약보고서.docx
+++ b/2026_미끼백신_향후실험일정_1장요약보고서.docx
@@ -769,7 +769,7 @@
               <w:br/>
               <w:t>• 10/17 설치 ➔ 10/20 현장 실측: 미끼B 10개 완식(100%), 미끼C 3개(30%), 미끼A·D·대조군 각 1개(10%)</w:t>
               <w:br/>
-              <w:t>• 10/20 멧돼지 섭취 4건, 10/22 미끼 접촉 4건, 10/23~25 오소리 비대상 관찰 15건 확보 / 24시간 상시 감시</w:t>
+              <w:t>• 10/20 멧돼지 4건, 10/22 접촉 4건, 10/26 멧돼지 집중섭취 5건, 오소리 비대상 18건 확보 / 24시간 감시</w:t>
             </w:r>
           </w:p>
         </w:tc>
@@ -793,7 +793,7 @@
               </w:rPr>
               <w:t>• 작업자: 권용태(사무국장)</w:t>
               <w:br/>
-              <w:t>• 10/17 설치 ➔ 10/20 실측 ➔ 10/22 접촉 ➔ 10/25 보충 ➔ 10/23~25 안전성 실증 (사진 23장, 영상 24건)</w:t>
+              <w:t>• 10/17 설치 ➔ 10/20 실측 ➔ 10/22 접촉 ➔ 10/25 보충 ➔ 10/26 집중섭취 실증 (사진 23장, 영상 32건)</w:t>
             </w:r>
           </w:p>
         </w:tc>

</xml_diff>

<commit_message>
feat: add 15 videos (4 confirmed wild boar pack up to 7 boars, 11 non-target badger) for 2026-10-27 on dashboard
</commit_message>
<xml_diff>
--- a/2026_미끼백신_향후실험일정_1장요약보고서.docx
+++ b/2026_미끼백신_향후실험일정_1장요약보고서.docx
@@ -769,7 +769,7 @@
               <w:br/>
               <w:t>• 10/17 설치 ➔ 10/20 현장 실측: 미끼B 10개 완식(100%), 미끼C 3개(30%), 미끼A·D·대조군 각 1개(10%)</w:t>
               <w:br/>
-              <w:t>• 10/20 멧돼지 4건, 10/22 접촉 4건, 10/26 멧돼지 집중섭취 5건, 오소리 비대상 18건 확보 / 24시간 감시</w:t>
+              <w:t>• 10/20 멧돼지 4건, 10/22 접촉 4건, 10/26 5건, 10/27 대군집(최대 7두) 4건, 오소리 29건 확보 / 24시간 감시</w:t>
             </w:r>
           </w:p>
         </w:tc>
@@ -793,7 +793,7 @@
               </w:rPr>
               <w:t>• 작업자: 권용태(사무국장)</w:t>
               <w:br/>
-              <w:t>• 10/17 설치 ➔ 10/20 실측 ➔ 10/22 접촉 ➔ 10/25 보충 ➔ 10/26 집중섭취 실증 (사진 23장, 영상 32건)</w:t>
+              <w:t>• 10/17 설치 ➔ 10/20 실측 ➔ 10/22 접촉 ➔ 10/25 보충 ➔ 10/26~27 군집(최대 7두) 실증 (사진 23장, 영상 47건)</w:t>
             </w:r>
           </w:p>
         </w:tc>

</xml_diff>

<commit_message>
feat: add 7 field photos (2026-10-27) verifying 100% solid feed intake after boar pack event
</commit_message>
<xml_diff>
--- a/2026_미끼백신_향후실험일정_1장요약보고서.docx
+++ b/2026_미끼백신_향후실험일정_1장요약보고서.docx
@@ -743,7 +743,7 @@
               </w:rPr>
               <w:t>10.17 ~ 10.31</w:t>
               <w:br/>
-              <w:t>(10/20 3일차실측)</w:t>
+              <w:t>(10/20 &amp; 10/27 실측)</w:t>
             </w:r>
           </w:p>
         </w:tc>
@@ -765,11 +765,13 @@
               <w:rPr>
                 <w:sz w:val="14"/>
               </w:rPr>
-              <w:t>공주 C지점(문금리 142-5) 미끼 4종 + 대조군(총 5종) 설치 및 3일차 섭취율 실측</w:t>
+              <w:t>공주 C지점(문금리 142-5) 미끼 4종 + 대조군(총 5종) 설치 및 1·2차 섭취율 실측</w:t>
               <w:br/>
-              <w:t>• 10/17 설치 ➔ 10/20 현장 실측: 미끼B 10개 완식(100%), 미끼C 3개(30%), 미끼A·D·대조군 각 1개(10%)</w:t>
+              <w:t>• 10/20 1차: 미끼B 10개 완식(100%), 미끼C 3개(30%), 기타 각 1개(10%)</w:t>
               <w:br/>
-              <w:t>• 10/20 멧돼지 4건, 10/22 접촉 4건, 10/26 5건, 10/27 대군집(최대 7두) 4건, 오소리 29건 확보 / 24시간 감시</w:t>
+              <w:t>• 10/27 2차(대군집 7두 출현): 고형사료 10개(지표 5+매립 5) 100% 완식, 미끼틀 0% 미접근</w:t>
+              <w:br/>
+              <w:t>• 10/20~27 멧돼지 18건(최대 7두 군집), 오소리 29건 관찰 / 24시간 감시</w:t>
             </w:r>
           </w:p>
         </w:tc>
@@ -793,7 +795,7 @@
               </w:rPr>
               <w:t>• 작업자: 권용태(사무국장)</w:t>
               <w:br/>
-              <w:t>• 10/17 설치 ➔ 10/20 실측 ➔ 10/22 접촉 ➔ 10/25 보충 ➔ 10/26~27 군집(최대 7두) 실증 (사진 23장, 영상 47건)</w:t>
+              <w:t>• 10/17 설치 ➔ 10/20 1차실측 ➔ 10/25 보충 ➔ 10/27 2차실측(고형사료 100% 완식) 실증 (현장사진 30장, 영상 47건)</w:t>
             </w:r>
           </w:p>
         </w:tc>

</xml_diff>

<commit_message>
feat: add 2 non-target badger videos (2026-10-27 evening) for C-site on dashboard
</commit_message>
<xml_diff>
--- a/2026_미끼백신_향후실험일정_1장요약보고서.docx
+++ b/2026_미끼백신_향후실험일정_1장요약보고서.docx
@@ -771,7 +771,7 @@
               <w:br/>
               <w:t>• 10/27 2차(대군집 7두 출현): 고형사료 10개(지표 5+매립 5) 100% 완식, 미끼틀 0% 미접근</w:t>
               <w:br/>
-              <w:t>• 10/20~27 멧돼지 18건(최대 7두 군집), 오소리 29건 관찰 / 24시간 감시</w:t>
+              <w:t>• 10/20~27 멧돼지 17건(최대 7두 군집), 오소리 32건(10/27 13건 등) 관찰 / 24시간 감시</w:t>
             </w:r>
           </w:p>
         </w:tc>
@@ -795,7 +795,7 @@
               </w:rPr>
               <w:t>• 작업자: 권용태(사무국장)</w:t>
               <w:br/>
-              <w:t>• 10/17 설치 ➔ 10/20 1차실측 ➔ 10/25 보충 ➔ 10/27 2차실측(고형사료 100% 완식) 실증 (현장사진 30장, 영상 47건)</w:t>
+              <w:t>• 10/17 설치 ➔ 10/20 1차실측 ➔ 10/25 보충 ➔ 10/27 2차실측(고형사료 100% 완식) 실증 (현장사진 30장, 영상 49건)</w:t>
             </w:r>
           </w:p>
         </w:tc>

</xml_diff>

<commit_message>
feat: add 3 non-target badger videos (2026-10-28 evening) for C-site on dashboard
</commit_message>
<xml_diff>
--- a/2026_미끼백신_향후실험일정_1장요약보고서.docx
+++ b/2026_미끼백신_향후실험일정_1장요약보고서.docx
@@ -771,7 +771,7 @@
               <w:br/>
               <w:t>• 10/27 2차(대군집 7두 출현): 고형사료 10개(지표 5+매립 5) 100% 완식, 미끼틀 0% 미접근</w:t>
               <w:br/>
-              <w:t>• 10/20~27 멧돼지 17건(최대 7두 군집), 오소리 32건(10/27 13건 등) 관찰 / 24시간 감시</w:t>
+              <w:t>• 10/20~28 멧돼지 17건(최대 7두 군집), 오소리 35건(10/27 13건, 10/28 3건 등) 관찰 / 24시간 감시</w:t>
             </w:r>
           </w:p>
         </w:tc>
@@ -795,7 +795,7 @@
               </w:rPr>
               <w:t>• 작업자: 권용태(사무국장)</w:t>
               <w:br/>
-              <w:t>• 10/17 설치 ➔ 10/20 1차실측 ➔ 10/25 보충 ➔ 10/27 2차실측(고형사료 100% 완식) 실증 (현장사진 30장, 영상 49건)</w:t>
+              <w:t>• 10/17 설치 ➔ 10/20 1차실측 ➔ 10/25 보충 ➔ 10/27 2차실측(고형사료 100% 완식) 실증 (현장사진 30장, 영상 52건)</w:t>
             </w:r>
           </w:p>
         </w:tc>

</xml_diff>

<commit_message>
feat: add 5 non-target badger videos (2026-10-29 night) for C-site on dashboard
</commit_message>
<xml_diff>
--- a/2026_미끼백신_향후실험일정_1장요약보고서.docx
+++ b/2026_미끼백신_향후실험일정_1장요약보고서.docx
@@ -771,7 +771,7 @@
               <w:br/>
               <w:t>• 10/27 2차(대군집 7두 출현): 고형사료 10개(지표 5+매립 5) 100% 완식, 미끼틀 0% 미접근</w:t>
               <w:br/>
-              <w:t>• 10/20~28 멧돼지 17건(최대 7두 군집), 오소리 35건(10/27 13건, 10/28 3건 등) 관찰 / 24시간 감시</w:t>
+              <w:t>• 10/20~29 멧돼지 17건(최대 7두 군집), 오소리 40건(10/27 13건, 10/28 3건, 10/29 5건 등) 관찰 / 24시간 감시</w:t>
             </w:r>
           </w:p>
         </w:tc>
@@ -795,7 +795,7 @@
               </w:rPr>
               <w:t>• 작업자: 권용태(사무국장)</w:t>
               <w:br/>
-              <w:t>• 10/17 설치 ➔ 10/20 1차실측 ➔ 10/25 보충 ➔ 10/27 2차실측(고형사료 100% 완식) 실증 (현장사진 30장, 영상 52건)</w:t>
+              <w:t>• 10/17 설치 ➔ 10/20 1차실측 ➔ 10/25 보충 ➔ 10/27 2차실측(고형사료 100% 완식) 실증 (현장사진 30장, 영상 57건)</w:t>
             </w:r>
           </w:p>
         </w:tc>

</xml_diff>

<commit_message>
feat: add 1 non-target badger video (2026-10-30 dawn) for C-site on dashboard
</commit_message>
<xml_diff>
--- a/2026_미끼백신_향후실험일정_1장요약보고서.docx
+++ b/2026_미끼백신_향후실험일정_1장요약보고서.docx
@@ -771,7 +771,7 @@
               <w:br/>
               <w:t>• 10/27 2차(대군집 7두 출현): 고형사료 10개(지표 5+매립 5) 100% 완식, 미끼틀 0% 미접근</w:t>
               <w:br/>
-              <w:t>• 10/20~29 멧돼지 17건(최대 7두 군집), 오소리 40건(10/27 13건, 10/28 3건, 10/29 5건 등) 관찰 / 24시간 감시</w:t>
+              <w:t>• 10/20~30 멧돼지 17건(최대 7두 군집), 오소리 41건(10/27 13건, 10/28 3건, 10/29 5건, 10/30 1건) 관찰 / 24시간 감시</w:t>
             </w:r>
           </w:p>
         </w:tc>
@@ -795,7 +795,7 @@
               </w:rPr>
               <w:t>• 작업자: 권용태(사무국장)</w:t>
               <w:br/>
-              <w:t>• 10/17 설치 ➔ 10/20 1차실측 ➔ 10/25 보충 ➔ 10/27 2차실측(고형사료 100% 완식) 실증 (현장사진 30장, 영상 57건)</w:t>
+              <w:t>• 10/17 설치 ➔ 10/20 1차실측 ➔ 10/25 보충 ➔ 10/27 2차실측(고형사료 100% 완식) 실증 (현장사진 30장, 영상 58건)</w:t>
             </w:r>
           </w:p>
         </w:tc>

</xml_diff>